<commit_message>
Finalisation de la rédaction du tableau 1. Ajout d'article potentiel pour validation de solution
</commit_message>
<xml_diff>
--- a/projet_final/projet_final/tableau_1.docx
+++ b/projet_final/projet_final/tableau_1.docx
@@ -101,7 +101,10 @@
           </w:tcPr>
           <w:p>
             <w:r>
-              <w:t>30</w:t>
+              <w:t>2</w:t>
+            </w:r>
+            <w:r>
+              <w:t>0</w:t>
             </w:r>
           </w:p>
         </w:tc>
@@ -330,13 +333,7 @@
               <w:rPr>
                 <w:rFonts w:ascii="Cambria Math" w:hAnsi="Cambria Math"/>
               </w:rPr>
-              <m:t>∂</m:t>
-            </m:r>
-            <m:r>
-              <w:rPr>
-                <w:rFonts w:ascii="Cambria Math" w:hAnsi="Cambria Math"/>
-              </w:rPr>
-              <m:t>T</m:t>
+              <m:t>∂T</m:t>
             </m:r>
           </m:num>
           <m:den>
@@ -344,13 +341,7 @@
               <w:rPr>
                 <w:rFonts w:ascii="Cambria Math" w:hAnsi="Cambria Math"/>
               </w:rPr>
-              <m:t>∂</m:t>
-            </m:r>
-            <m:r>
-              <w:rPr>
-                <w:rFonts w:ascii="Cambria Math" w:hAnsi="Cambria Math"/>
-              </w:rPr>
-              <m:t>t</m:t>
+              <m:t>∂t</m:t>
             </m:r>
           </m:den>
         </m:f>
@@ -358,13 +349,7 @@
           <w:rPr>
             <w:rFonts w:ascii="Cambria Math" w:hAnsi="Cambria Math"/>
           </w:rPr>
-          <m:t xml:space="preserve">= </m:t>
-        </m:r>
-        <m:r>
-          <w:rPr>
-            <w:rFonts w:ascii="Cambria Math" w:hAnsi="Cambria Math"/>
-          </w:rPr>
-          <m:t>k</m:t>
+          <m:t>= k</m:t>
         </m:r>
         <m:sSup>
           <m:sSupPr>
@@ -464,14 +449,12 @@
         </w:rPr>
         <w:t xml:space="preserve">des effets de convection et radiation en ses </w:t>
       </w:r>
-      <w:proofErr w:type="spellStart"/>
-      <w:r>
-        <w:rPr>
-          <w:rFonts w:eastAsiaTheme="minorEastAsia"/>
-        </w:rPr>
-        <w:t>paroies</w:t>
-      </w:r>
-      <w:proofErr w:type="spellEnd"/>
+      <w:r>
+        <w:rPr>
+          <w:rFonts w:eastAsiaTheme="minorEastAsia"/>
+        </w:rPr>
+        <w:t>parois</w:t>
+      </w:r>
       <w:r>
         <w:rPr>
           <w:rFonts w:eastAsiaTheme="minorEastAsia"/>
@@ -489,6 +472,74 @@
         <w:rPr>
           <w:rFonts w:eastAsiaTheme="minorEastAsia"/>
         </w:rPr>
+        <w:drawing>
+          <wp:anchor distT="0" distB="0" distL="114300" distR="114300" simplePos="0" relativeHeight="251658240" behindDoc="1" locked="0" layoutInCell="1" allowOverlap="1" wp14:anchorId="0D47D0F0" wp14:editId="142CAAA0">
+            <wp:simplePos x="0" y="0"/>
+            <wp:positionH relativeFrom="column">
+              <wp:posOffset>4308958</wp:posOffset>
+            </wp:positionH>
+            <wp:positionV relativeFrom="paragraph">
+              <wp:posOffset>3801</wp:posOffset>
+            </wp:positionV>
+            <wp:extent cx="1640205" cy="2204085"/>
+            <wp:effectExtent l="0" t="0" r="0" b="5715"/>
+            <wp:wrapTight wrapText="bothSides">
+              <wp:wrapPolygon edited="0">
+                <wp:start x="0" y="0"/>
+                <wp:lineTo x="0" y="21469"/>
+                <wp:lineTo x="21324" y="21469"/>
+                <wp:lineTo x="21324" y="0"/>
+                <wp:lineTo x="0" y="0"/>
+              </wp:wrapPolygon>
+            </wp:wrapTight>
+            <wp:docPr id="889569146" name="Image 1"/>
+            <wp:cNvGraphicFramePr>
+              <a:graphicFrameLocks xmlns:a="http://schemas.openxmlformats.org/drawingml/2006/main" noChangeAspect="1"/>
+            </wp:cNvGraphicFramePr>
+            <a:graphic xmlns:a="http://schemas.openxmlformats.org/drawingml/2006/main">
+              <a:graphicData uri="http://schemas.openxmlformats.org/drawingml/2006/picture">
+                <pic:pic xmlns:pic="http://schemas.openxmlformats.org/drawingml/2006/picture">
+                  <pic:nvPicPr>
+                    <pic:cNvPr id="889569146" name=""/>
+                    <pic:cNvPicPr/>
+                  </pic:nvPicPr>
+                  <pic:blipFill>
+                    <a:blip r:embed="rId6">
+                      <a:extLst>
+                        <a:ext uri="{28A0092B-C50C-407E-A947-70E740481C1C}">
+                          <a14:useLocalDpi xmlns:a14="http://schemas.microsoft.com/office/drawing/2010/main" val="0"/>
+                        </a:ext>
+                      </a:extLst>
+                    </a:blip>
+                    <a:stretch>
+                      <a:fillRect/>
+                    </a:stretch>
+                  </pic:blipFill>
+                  <pic:spPr>
+                    <a:xfrm>
+                      <a:off x="0" y="0"/>
+                      <a:ext cx="1640205" cy="2204085"/>
+                    </a:xfrm>
+                    <a:prstGeom prst="rect">
+                      <a:avLst/>
+                    </a:prstGeom>
+                  </pic:spPr>
+                </pic:pic>
+              </a:graphicData>
+            </a:graphic>
+            <wp14:sizeRelH relativeFrom="margin">
+              <wp14:pctWidth>0</wp14:pctWidth>
+            </wp14:sizeRelH>
+            <wp14:sizeRelV relativeFrom="margin">
+              <wp14:pctHeight>0</wp14:pctHeight>
+            </wp14:sizeRelV>
+          </wp:anchor>
+        </w:drawing>
+      </w:r>
+      <w:r>
+        <w:rPr>
+          <w:rFonts w:eastAsiaTheme="minorEastAsia"/>
+        </w:rPr>
         <w:t xml:space="preserve">Le code </w:t>
       </w:r>
       <w:r>
@@ -580,6 +631,38 @@
           <w:rFonts w:eastAsiaTheme="minorEastAsia"/>
         </w:rPr>
         <w:t xml:space="preserve">Le projet se limitera à la </w:t>
+      </w:r>
+      <w:r>
+        <w:rPr>
+          <w:rFonts w:eastAsiaTheme="minorEastAsia"/>
+        </w:rPr>
+        <w:t>vérification de code. En effet, une recherche approfondie a été effectuée pour trouver des cas réels de mesure de la température en paroi de cylindre, mais les exemples manquaient soit trop d’information sur l’incertitude</w:t>
+      </w:r>
+      <w:r>
+        <w:rPr>
+          <w:rStyle w:val="Appelnotedebasdep"/>
+          <w:rFonts w:eastAsiaTheme="minorEastAsia"/>
+        </w:rPr>
+        <w:footnoteReference w:id="1"/>
+      </w:r>
+      <w:r>
+        <w:rPr>
+          <w:rFonts w:eastAsiaTheme="minorEastAsia"/>
+        </w:rPr>
+        <w:t>, soit les géométries étaient trop complexes</w:t>
+      </w:r>
+      <w:r>
+        <w:rPr>
+          <w:rStyle w:val="Appelnotedebasdep"/>
+          <w:rFonts w:eastAsiaTheme="minorEastAsia"/>
+        </w:rPr>
+        <w:footnoteReference w:id="2"/>
+      </w:r>
+      <w:r>
+        <w:rPr>
+          <w:rFonts w:eastAsiaTheme="minorEastAsia"/>
+        </w:rPr>
+        <w:t>.</w:t>
       </w:r>
     </w:p>
     <w:sectPr>
@@ -590,6 +673,110 @@
     </w:sectPr>
   </w:body>
 </w:document>
+</file>
+
+<file path=word/endnotes.xml><?xml version="1.0" encoding="utf-8"?>
+<w:endnotes xmlns:wpc="http://schemas.microsoft.com/office/word/2010/wordprocessingCanvas" xmlns:cx="http://schemas.microsoft.com/office/drawing/2014/chartex" xmlns:cx1="http://schemas.microsoft.com/office/drawing/2015/9/8/chartex" xmlns:cx2="http://schemas.microsoft.com/office/drawing/2015/10/21/chartex" xmlns:cx3="http://schemas.microsoft.com/office/drawing/2016/5/9/chartex" xmlns:cx4="http://schemas.microsoft.com/office/drawing/2016/5/10/chartex" xmlns:cx5="http://schemas.microsoft.com/office/drawing/2016/5/11/chartex" xmlns:cx6="http://schemas.microsoft.com/office/drawing/2016/5/12/chartex" xmlns:cx7="http://schemas.microsoft.com/office/drawing/2016/5/13/chartex" xmlns:cx8="http://schemas.microsoft.com/office/drawing/2016/5/14/chartex" xmlns:mc="http://schemas.openxmlformats.org/markup-compatibility/2006" xmlns:aink="http://schemas.microsoft.com/office/drawing/2016/ink" xmlns:am3d="http://schemas.microsoft.com/office/drawing/2017/model3d" xmlns:o="urn:schemas-microsoft-com:office:office" xmlns:oel="http://schemas.microsoft.com/office/2019/extlst" xmlns:r="http://schemas.openxmlformats.org/officeDocument/2006/relationships" xmlns:m="http://schemas.openxmlformats.org/officeDocument/2006/math" xmlns:v="urn:schemas-microsoft-com:vml" xmlns:wp14="http://schemas.microsoft.com/office/word/2010/wordprocessingDrawing" xmlns:wp="http://schemas.openxmlformats.org/drawingml/2006/wordprocessingDrawing" xmlns:w10="urn:schemas-microsoft-com:office:word" xmlns:w="http://schemas.openxmlformats.org/wordprocessingml/2006/main" xmlns:w14="http://schemas.microsoft.com/office/word/2010/wordml" xmlns:w15="http://schemas.microsoft.com/office/word/2012/wordml" xmlns:w16cex="http://schemas.microsoft.com/office/word/2018/wordml/cex" xmlns:w16cid="http://schemas.microsoft.com/office/word/2016/wordml/cid" xmlns:w16="http://schemas.microsoft.com/office/word/2018/wordml" xmlns:w16du="http://schemas.microsoft.com/office/word/2023/wordml/word16du" xmlns:w16sdtdh="http://schemas.microsoft.com/office/word/2020/wordml/sdtdatahash" xmlns:w16sdtfl="http://schemas.microsoft.com/office/word/2024/wordml/sdtformatlock" xmlns:w16se="http://schemas.microsoft.com/office/word/2015/wordml/symex" xmlns:wpg="http://schemas.microsoft.com/office/word/2010/wordprocessingGroup" xmlns:wpi="http://schemas.microsoft.com/office/word/2010/wordprocessingInk" xmlns:wne="http://schemas.microsoft.com/office/word/2006/wordml" xmlns:wps="http://schemas.microsoft.com/office/word/2010/wordprocessingShape" mc:Ignorable="w14 w15 w16se w16cid w16 w16cex w16sdtdh w16sdtfl w16du wp14">
+  <w:endnote w:type="separator" w:id="-1">
+    <w:p>
+      <w:pPr>
+        <w:spacing w:after="0" w:line="240" w:lineRule="auto"/>
+      </w:pPr>
+      <w:r>
+        <w:separator/>
+      </w:r>
+    </w:p>
+  </w:endnote>
+  <w:endnote w:type="continuationSeparator" w:id="0">
+    <w:p>
+      <w:pPr>
+        <w:spacing w:after="0" w:line="240" w:lineRule="auto"/>
+      </w:pPr>
+      <w:r>
+        <w:continuationSeparator/>
+      </w:r>
+    </w:p>
+  </w:endnote>
+</w:endnotes>
+</file>
+
+<file path=word/footnotes.xml><?xml version="1.0" encoding="utf-8"?>
+<w:footnotes xmlns:wpc="http://schemas.microsoft.com/office/word/2010/wordprocessingCanvas" xmlns:cx="http://schemas.microsoft.com/office/drawing/2014/chartex" xmlns:cx1="http://schemas.microsoft.com/office/drawing/2015/9/8/chartex" xmlns:cx2="http://schemas.microsoft.com/office/drawing/2015/10/21/chartex" xmlns:cx3="http://schemas.microsoft.com/office/drawing/2016/5/9/chartex" xmlns:cx4="http://schemas.microsoft.com/office/drawing/2016/5/10/chartex" xmlns:cx5="http://schemas.microsoft.com/office/drawing/2016/5/11/chartex" xmlns:cx6="http://schemas.microsoft.com/office/drawing/2016/5/12/chartex" xmlns:cx7="http://schemas.microsoft.com/office/drawing/2016/5/13/chartex" xmlns:cx8="http://schemas.microsoft.com/office/drawing/2016/5/14/chartex" xmlns:mc="http://schemas.openxmlformats.org/markup-compatibility/2006" xmlns:aink="http://schemas.microsoft.com/office/drawing/2016/ink" xmlns:am3d="http://schemas.microsoft.com/office/drawing/2017/model3d" xmlns:o="urn:schemas-microsoft-com:office:office" xmlns:oel="http://schemas.microsoft.com/office/2019/extlst" xmlns:r="http://schemas.openxmlformats.org/officeDocument/2006/relationships" xmlns:m="http://schemas.openxmlformats.org/officeDocument/2006/math" xmlns:v="urn:schemas-microsoft-com:vml" xmlns:wp14="http://schemas.microsoft.com/office/word/2010/wordprocessingDrawing" xmlns:wp="http://schemas.openxmlformats.org/drawingml/2006/wordprocessingDrawing" xmlns:w10="urn:schemas-microsoft-com:office:word" xmlns:w="http://schemas.openxmlformats.org/wordprocessingml/2006/main" xmlns:w14="http://schemas.microsoft.com/office/word/2010/wordml" xmlns:w15="http://schemas.microsoft.com/office/word/2012/wordml" xmlns:w16cex="http://schemas.microsoft.com/office/word/2018/wordml/cex" xmlns:w16cid="http://schemas.microsoft.com/office/word/2016/wordml/cid" xmlns:w16="http://schemas.microsoft.com/office/word/2018/wordml" xmlns:w16du="http://schemas.microsoft.com/office/word/2023/wordml/word16du" xmlns:w16sdtdh="http://schemas.microsoft.com/office/word/2020/wordml/sdtdatahash" xmlns:w16sdtfl="http://schemas.microsoft.com/office/word/2024/wordml/sdtformatlock" xmlns:w16se="http://schemas.microsoft.com/office/word/2015/wordml/symex" xmlns:wpg="http://schemas.microsoft.com/office/word/2010/wordprocessingGroup" xmlns:wpi="http://schemas.microsoft.com/office/word/2010/wordprocessingInk" xmlns:wne="http://schemas.microsoft.com/office/word/2006/wordml" xmlns:wps="http://schemas.microsoft.com/office/word/2010/wordprocessingShape" mc:Ignorable="w14 w15 w16se w16cid w16 w16cex w16sdtdh w16sdtfl w16du wp14">
+  <w:footnote w:type="separator" w:id="-1">
+    <w:p>
+      <w:pPr>
+        <w:spacing w:after="0" w:line="240" w:lineRule="auto"/>
+      </w:pPr>
+      <w:r>
+        <w:separator/>
+      </w:r>
+    </w:p>
+  </w:footnote>
+  <w:footnote w:type="continuationSeparator" w:id="0">
+    <w:p>
+      <w:pPr>
+        <w:spacing w:after="0" w:line="240" w:lineRule="auto"/>
+      </w:pPr>
+      <w:r>
+        <w:continuationSeparator/>
+      </w:r>
+    </w:p>
+  </w:footnote>
+  <w:footnote w:id="1">
+    <w:p>
+      <w:pPr>
+        <w:pStyle w:val="Notedebasdepage"/>
+      </w:pPr>
+      <w:r>
+        <w:rPr>
+          <w:rStyle w:val="Appelnotedebasdep"/>
+        </w:rPr>
+        <w:footnoteRef/>
+      </w:r>
+      <w:r>
+        <w:t xml:space="preserve"> </w:t>
+      </w:r>
+      <w:hyperlink r:id="rId1" w:history="1">
+        <w:r>
+          <w:rPr>
+            <w:rStyle w:val="Lienhypertexte"/>
+          </w:rPr>
+          <w:t>https://www.m-hikari.com/ces/ces2017/ces21-24-2017/p/valenciaCES21-24-2017-3.pdf?utm_source=chatgpt.com</w:t>
+        </w:r>
+      </w:hyperlink>
+    </w:p>
+  </w:footnote>
+  <w:footnote w:id="2">
+    <w:p>
+      <w:pPr>
+        <w:pStyle w:val="Notedebasdepage"/>
+      </w:pPr>
+      <w:r>
+        <w:rPr>
+          <w:rStyle w:val="Appelnotedebasdep"/>
+        </w:rPr>
+        <w:footnoteRef/>
+      </w:r>
+      <w:r>
+        <w:t xml:space="preserve"> </w:t>
+      </w:r>
+      <w:hyperlink r:id="rId2" w:history="1">
+        <w:r>
+          <w:rPr>
+            <w:rStyle w:val="Lienhypertexte"/>
+          </w:rPr>
+          <w:t>https://pmc.ncbi.nlm.nih.gov/articles/PMC8415572/</w:t>
+        </w:r>
+        <w:r>
+          <w:rPr>
+            <w:rStyle w:val="Lienhypertexte"/>
+          </w:rPr>
+          <w:t>~</w:t>
+        </w:r>
+      </w:hyperlink>
+    </w:p>
+  </w:footnote>
+</w:footnotes>
 </file>
 
 <file path=word/styles.xml><?xml version="1.0" encoding="utf-8"?>
@@ -1538,6 +1725,68 @@
       <w:color w:val="666666"/>
     </w:rPr>
   </w:style>
+  <w:style w:type="paragraph" w:styleId="Notedebasdepage">
+    <w:name w:val="footnote text"/>
+    <w:basedOn w:val="Normal"/>
+    <w:link w:val="NotedebasdepageCar"/>
+    <w:uiPriority w:val="99"/>
+    <w:semiHidden/>
+    <w:unhideWhenUsed/>
+    <w:rsid w:val="0086558E"/>
+    <w:pPr>
+      <w:spacing w:after="0" w:line="240" w:lineRule="auto"/>
+    </w:pPr>
+    <w:rPr>
+      <w:sz w:val="20"/>
+      <w:szCs w:val="20"/>
+    </w:rPr>
+  </w:style>
+  <w:style w:type="character" w:customStyle="1" w:styleId="NotedebasdepageCar">
+    <w:name w:val="Note de bas de page Car"/>
+    <w:basedOn w:val="Policepardfaut"/>
+    <w:link w:val="Notedebasdepage"/>
+    <w:uiPriority w:val="99"/>
+    <w:semiHidden/>
+    <w:rsid w:val="0086558E"/>
+    <w:rPr>
+      <w:sz w:val="20"/>
+      <w:szCs w:val="20"/>
+    </w:rPr>
+  </w:style>
+  <w:style w:type="character" w:styleId="Appelnotedebasdep">
+    <w:name w:val="footnote reference"/>
+    <w:basedOn w:val="Policepardfaut"/>
+    <w:uiPriority w:val="99"/>
+    <w:semiHidden/>
+    <w:unhideWhenUsed/>
+    <w:rsid w:val="0086558E"/>
+    <w:rPr>
+      <w:vertAlign w:val="superscript"/>
+    </w:rPr>
+  </w:style>
+  <w:style w:type="character" w:styleId="Lienhypertexte">
+    <w:name w:val="Hyperlink"/>
+    <w:basedOn w:val="Policepardfaut"/>
+    <w:uiPriority w:val="99"/>
+    <w:unhideWhenUsed/>
+    <w:rsid w:val="0086558E"/>
+    <w:rPr>
+      <w:color w:val="467886" w:themeColor="hyperlink"/>
+      <w:u w:val="single"/>
+    </w:rPr>
+  </w:style>
+  <w:style w:type="character" w:styleId="Mentionnonrsolue">
+    <w:name w:val="Unresolved Mention"/>
+    <w:basedOn w:val="Policepardfaut"/>
+    <w:uiPriority w:val="99"/>
+    <w:semiHidden/>
+    <w:unhideWhenUsed/>
+    <w:rsid w:val="0086558E"/>
+    <w:rPr>
+      <w:color w:val="605E5C"/>
+      <w:shd w:val="clear" w:color="auto" w:fill="E1DFDD"/>
+    </w:rPr>
+  </w:style>
 </w:styles>
 </file>
 

</xml_diff>